<commit_message>
SystemDesign: AsyncMessaging patterns part1
</commit_message>
<xml_diff>
--- a/Microservices/Microservices_AsyncMessaging.docx
+++ b/Microservices/Microservices_AsyncMessaging.docx
@@ -59,233 +59,254 @@
         <w:pStyle w:val="Normal"/>
         <w:bidi w:val="0"/>
         <w:jc w:val="start"/>
-        <w:rPr/>
-      </w:pPr>
-      <w:r>
-        <w:rPr/>
-        <w:t>How to solve common problems in Microservices using Asynchronous patterns</w:t>
-      </w:r>
-    </w:p>
-    <w:p>
-      <w:pPr>
-        <w:pStyle w:val="Normal"/>
-        <w:bidi w:val="0"/>
-        <w:jc w:val="start"/>
-        <w:rPr/>
-      </w:pPr>
-      <w:r>
-        <w:rPr/>
-      </w:r>
-    </w:p>
-    <w:p>
-      <w:pPr>
-        <w:pStyle w:val="Normal"/>
-        <w:bidi w:val="0"/>
-        <w:jc w:val="start"/>
-        <w:rPr/>
-      </w:pPr>
-      <w:r>
-        <w:rPr/>
-        <w:t>Prerequisites:</w:t>
-      </w:r>
-    </w:p>
-    <w:p>
-      <w:pPr>
-        <w:pStyle w:val="Normal"/>
-        <w:bidi w:val="0"/>
-        <w:jc w:val="start"/>
-        <w:rPr/>
-      </w:pPr>
-      <w:r>
-        <w:rPr/>
-        <w:t>Understanding of Microservices architecture</w:t>
-      </w:r>
-    </w:p>
-    <w:p>
-      <w:pPr>
-        <w:pStyle w:val="Normal"/>
-        <w:bidi w:val="0"/>
-        <w:jc w:val="start"/>
-        <w:rPr/>
-      </w:pPr>
-      <w:r>
-        <w:rPr/>
-        <w:t>RestFul communications over HTTP</w:t>
-      </w:r>
-    </w:p>
-    <w:p>
-      <w:pPr>
-        <w:pStyle w:val="Normal"/>
-        <w:bidi w:val="0"/>
-        <w:jc w:val="start"/>
-        <w:rPr/>
-      </w:pPr>
-      <w:r>
-        <w:rPr/>
-        <w:t>TCP/IP in the context of HTTP</w:t>
-      </w:r>
-    </w:p>
-    <w:p>
-      <w:pPr>
-        <w:pStyle w:val="Normal"/>
-        <w:bidi w:val="0"/>
-        <w:jc w:val="start"/>
-        <w:rPr/>
-      </w:pPr>
-      <w:r>
-        <w:rPr/>
-        <w:t>Basic understanding of Asynchronous messaging</w:t>
-      </w:r>
-    </w:p>
-    <w:p>
-      <w:pPr>
-        <w:pStyle w:val="Normal"/>
-        <w:bidi w:val="0"/>
-        <w:jc w:val="start"/>
-        <w:rPr/>
-      </w:pPr>
-      <w:r>
-        <w:rPr/>
-      </w:r>
-    </w:p>
-    <w:p>
-      <w:pPr>
-        <w:pStyle w:val="Normal"/>
-        <w:bidi w:val="0"/>
-        <w:jc w:val="start"/>
-        <w:rPr/>
-      </w:pPr>
-      <w:r>
-        <w:rPr/>
-        <w:t>When dealing with System to System calls, we have two strategies: Traditional synchronous model and Asynchronous model for interservices communications</w:t>
-      </w:r>
-    </w:p>
-    <w:p>
-      <w:pPr>
-        <w:pStyle w:val="Normal"/>
-        <w:bidi w:val="0"/>
-        <w:jc w:val="start"/>
-        <w:rPr/>
-      </w:pPr>
-      <w:r>
-        <w:rPr/>
-      </w:r>
-    </w:p>
-    <w:p>
-      <w:pPr>
-        <w:pStyle w:val="Normal"/>
-        <w:bidi w:val="0"/>
-        <w:jc w:val="start"/>
-        <w:rPr/>
-      </w:pPr>
-      <w:r>
-        <w:rPr/>
-        <w:t>Standard model of communication (Synchronous):</w:t>
-      </w:r>
-    </w:p>
-    <w:p>
-      <w:pPr>
-        <w:pStyle w:val="Normal"/>
-        <w:bidi w:val="0"/>
-        <w:jc w:val="start"/>
-        <w:rPr/>
-      </w:pPr>
-      <w:r>
-        <w:rPr/>
-        <w:t xml:space="preserve">Service-to-Service communication is over </w:t>
-      </w:r>
-      <w:r>
         <w:rPr>
           <w:i/>
           <w:iCs/>
         </w:rPr>
-        <w:t>HTTP using Rest</w:t>
-      </w:r>
-    </w:p>
-    <w:p>
-      <w:pPr>
-        <w:pStyle w:val="Normal"/>
-        <w:bidi w:val="0"/>
-        <w:jc w:val="start"/>
-        <w:rPr/>
-      </w:pPr>
-      <w:r>
-        <w:rPr/>
-      </w:r>
-    </w:p>
-    <w:p>
-      <w:pPr>
-        <w:pStyle w:val="Normal"/>
-        <w:bidi w:val="0"/>
-        <w:jc w:val="start"/>
-        <w:rPr/>
-      </w:pPr>
-      <w:r>
-        <w:rPr/>
-        <w:t>ServiceA ====&gt; Request ===&gt; Process request and it responds back to the Service</w:t>
-      </w:r>
-    </w:p>
-    <w:p>
-      <w:pPr>
-        <w:pStyle w:val="Normal"/>
-        <w:bidi w:val="0"/>
-        <w:jc w:val="start"/>
-        <w:rPr/>
-      </w:pPr>
-      <w:r>
-        <w:rPr/>
-        <w:t xml:space="preserve">calls are </w:t>
-      </w:r>
+      </w:pPr>
       <w:r>
         <w:rPr>
           <w:i/>
           <w:iCs/>
         </w:rPr>
-        <w:t>synchronous in nature</w:t>
-      </w:r>
-      <w:r>
-        <w:rPr/>
-        <w:t xml:space="preserve"> (meaning the caller service waits for a response and this response is sent after the request is fully processed. Therefore, each call becomes a </w:t>
+        <w:t>How to solve common problems in Microservices using Asynchronous patterns</w:t>
+      </w:r>
+    </w:p>
+    <w:p>
+      <w:pPr>
+        <w:pStyle w:val="Normal"/>
+        <w:bidi w:val="0"/>
+        <w:jc w:val="start"/>
+        <w:rPr/>
+      </w:pPr>
+      <w:r>
+        <w:rPr/>
+      </w:r>
+    </w:p>
+    <w:p>
+      <w:pPr>
+        <w:pStyle w:val="Normal"/>
+        <w:bidi w:val="0"/>
+        <w:jc w:val="start"/>
+        <w:rPr>
+          <w:u w:val="single"/>
+        </w:rPr>
+      </w:pPr>
+      <w:r>
+        <w:rPr>
+          <w:u w:val="single"/>
+        </w:rPr>
+        <w:t>Prerequisites:</w:t>
+      </w:r>
+    </w:p>
+    <w:p>
+      <w:pPr>
+        <w:pStyle w:val="Normal"/>
+        <w:bidi w:val="0"/>
+        <w:jc w:val="start"/>
+        <w:rPr/>
+      </w:pPr>
+      <w:r>
+        <w:rPr/>
+        <w:t>Understanding of Microservices architecture</w:t>
+      </w:r>
+    </w:p>
+    <w:p>
+      <w:pPr>
+        <w:pStyle w:val="Normal"/>
+        <w:bidi w:val="0"/>
+        <w:jc w:val="start"/>
+        <w:rPr/>
+      </w:pPr>
+      <w:r>
+        <w:rPr/>
+        <w:t>RestFul communications over HTTP</w:t>
+      </w:r>
+    </w:p>
+    <w:p>
+      <w:pPr>
+        <w:pStyle w:val="Normal"/>
+        <w:bidi w:val="0"/>
+        <w:jc w:val="start"/>
+        <w:rPr/>
+      </w:pPr>
+      <w:r>
+        <w:rPr/>
+        <w:t>TCP/IP in the context of HTTP</w:t>
+      </w:r>
+    </w:p>
+    <w:p>
+      <w:pPr>
+        <w:pStyle w:val="Normal"/>
+        <w:bidi w:val="0"/>
+        <w:jc w:val="start"/>
+        <w:rPr/>
+      </w:pPr>
+      <w:r>
+        <w:rPr/>
+        <w:t>Basic understanding of Asynchronous messaging</w:t>
+      </w:r>
+    </w:p>
+    <w:p>
+      <w:pPr>
+        <w:pStyle w:val="Normal"/>
+        <w:bidi w:val="0"/>
+        <w:jc w:val="start"/>
+        <w:rPr/>
+      </w:pPr>
+      <w:r>
+        <w:rPr/>
+      </w:r>
+    </w:p>
+    <w:p>
+      <w:pPr>
+        <w:pStyle w:val="Normal"/>
+        <w:bidi w:val="0"/>
+        <w:jc w:val="start"/>
+        <w:rPr/>
+      </w:pPr>
+      <w:r>
+        <w:rPr/>
+        <w:t xml:space="preserve">When dealing with System to System calls, we have two strategies: </w:t>
       </w:r>
       <w:r>
         <w:rPr>
           <w:i/>
           <w:iCs/>
         </w:rPr>
-        <w:t>“Blocking” call</w:t>
-      </w:r>
-      <w:r>
-        <w:rPr/>
-        <w:t xml:space="preserve"> that the client must wait on a success or failure, based on the status code from the Service being called, before it can proceed with other things.</w:t>
-      </w:r>
-    </w:p>
-    <w:p>
-      <w:pPr>
-        <w:pStyle w:val="Normal"/>
-        <w:bidi w:val="0"/>
-        <w:jc w:val="start"/>
-        <w:rPr/>
-      </w:pPr>
-      <w:r>
-        <w:rPr/>
-        <w:t xml:space="preserve">So call paths can </w:t>
+        <w:t>Traditional synchronous model and Asynchronous model for interservices communications</w:t>
+      </w:r>
+    </w:p>
+    <w:p>
+      <w:pPr>
+        <w:pStyle w:val="Normal"/>
+        <w:bidi w:val="0"/>
+        <w:jc w:val="start"/>
+        <w:rPr/>
+      </w:pPr>
+      <w:r>
+        <w:rPr/>
+      </w:r>
+    </w:p>
+    <w:p>
+      <w:pPr>
+        <w:pStyle w:val="Normal"/>
+        <w:bidi w:val="0"/>
+        <w:jc w:val="start"/>
+        <w:rPr>
+          <w:u w:val="single"/>
+        </w:rPr>
+      </w:pPr>
+      <w:r>
+        <w:rPr>
+          <w:u w:val="single"/>
+        </w:rPr>
+        <w:t>Standard model of communication (Synchronous):</w:t>
+      </w:r>
+    </w:p>
+    <w:p>
+      <w:pPr>
+        <w:pStyle w:val="Normal"/>
+        <w:bidi w:val="0"/>
+        <w:jc w:val="start"/>
+        <w:rPr/>
+      </w:pPr>
+      <w:r>
+        <w:rPr/>
+        <w:t xml:space="preserve">Service-to-Service communication is over </w:t>
       </w:r>
       <w:r>
         <w:rPr>
           <w:i/>
           <w:iCs/>
         </w:rPr>
-        <w:t>become deep</w:t>
-      </w:r>
-      <w:r>
-        <w:rPr/>
-        <w:t xml:space="preserve"> and it could become a </w:t>
+        <w:t>HTTP using Rest</w:t>
+      </w:r>
+    </w:p>
+    <w:p>
+      <w:pPr>
+        <w:pStyle w:val="Normal"/>
+        <w:bidi w:val="0"/>
+        <w:jc w:val="start"/>
+        <w:rPr/>
+      </w:pPr>
+      <w:r>
+        <w:rPr/>
+      </w:r>
+    </w:p>
+    <w:p>
+      <w:pPr>
+        <w:pStyle w:val="Normal"/>
+        <w:bidi w:val="0"/>
+        <w:jc w:val="start"/>
+        <w:rPr/>
+      </w:pPr>
+      <w:r>
+        <w:rPr/>
+        <w:t>ServiceA ====&gt; Request ===&gt; Process request and it responds back to the Service</w:t>
+      </w:r>
+    </w:p>
+    <w:p>
+      <w:pPr>
+        <w:pStyle w:val="Normal"/>
+        <w:bidi w:val="0"/>
+        <w:jc w:val="start"/>
+        <w:rPr/>
+      </w:pPr>
+      <w:r>
+        <w:rPr/>
+        <w:t xml:space="preserve">calls are </w:t>
       </w:r>
       <w:r>
         <w:rPr>
           <w:i/>
           <w:iCs/>
         </w:rPr>
+        <w:t>synchronous in nature</w:t>
+      </w:r>
+      <w:r>
+        <w:rPr/>
+        <w:t xml:space="preserve"> (meaning the caller service waits for a response and this response is sent after the request is fully processed. Therefore, each call becomes a </w:t>
+      </w:r>
+      <w:r>
+        <w:rPr>
+          <w:i/>
+          <w:iCs/>
+        </w:rPr>
+        <w:t>“Blocking” call</w:t>
+      </w:r>
+      <w:r>
+        <w:rPr/>
+        <w:t xml:space="preserve"> that the client must wait on a success or failure, based on the status code from the Service being called, before it can proceed with other things.</w:t>
+      </w:r>
+    </w:p>
+    <w:p>
+      <w:pPr>
+        <w:pStyle w:val="Normal"/>
+        <w:bidi w:val="0"/>
+        <w:jc w:val="start"/>
+        <w:rPr/>
+      </w:pPr>
+      <w:r>
+        <w:rPr/>
+        <w:t xml:space="preserve">So call paths can </w:t>
+      </w:r>
+      <w:r>
+        <w:rPr>
+          <w:i/>
+          <w:iCs/>
+        </w:rPr>
+        <w:t>become deep</w:t>
+      </w:r>
+      <w:r>
+        <w:rPr/>
+        <w:t xml:space="preserve"> and it could become a </w:t>
+      </w:r>
+      <w:r>
+        <w:rPr>
+          <w:i/>
+          <w:iCs/>
+        </w:rPr>
         <w:t>bottleneck</w:t>
       </w:r>
       <w:r>
@@ -320,10 +341,18 @@
         <w:pStyle w:val="Normal"/>
         <w:bidi w:val="0"/>
         <w:jc w:val="start"/>
-        <w:rPr/>
-      </w:pPr>
-      <w:r>
-        <w:rPr/>
+        <w:rPr>
+          <w:i/>
+          <w:iCs/>
+          <w:u w:val="single"/>
+        </w:rPr>
+      </w:pPr>
+      <w:r>
+        <w:rPr>
+          <w:i/>
+          <w:iCs/>
+          <w:u w:val="single"/>
+        </w:rPr>
         <w:t>Second option is Asynchronous communication:</w:t>
       </w:r>
     </w:p>
@@ -1490,6 +1519,1287 @@
       <w:r>
         <w:rPr/>
         <w:t xml:space="preserve"> go. Several reasons for errors from format issues like structure or length, timeouts from not being read quick enough by the Consumer, queue is full and it cannot accept new messages.</w:t>
+      </w:r>
+    </w:p>
+    <w:p>
+      <w:pPr>
+        <w:pStyle w:val="Normal"/>
+        <w:bidi w:val="0"/>
+        <w:jc w:val="start"/>
+        <w:rPr/>
+      </w:pPr>
+      <w:r>
+        <w:rPr/>
+      </w:r>
+    </w:p>
+    <w:p>
+      <w:pPr>
+        <w:pStyle w:val="Normal"/>
+        <w:bidi w:val="0"/>
+        <w:jc w:val="start"/>
+        <w:rPr/>
+      </w:pPr>
+      <w:r>
+        <w:rPr/>
+      </w:r>
+    </w:p>
+    <w:p>
+      <w:pPr>
+        <w:pStyle w:val="Normal"/>
+        <w:bidi w:val="0"/>
+        <w:jc w:val="start"/>
+        <w:rPr/>
+      </w:pPr>
+      <w:r>
+        <w:rPr/>
+      </w:r>
+    </w:p>
+    <w:p>
+      <w:pPr>
+        <w:pStyle w:val="Normal"/>
+        <w:bidi w:val="0"/>
+        <w:jc w:val="start"/>
+        <w:rPr/>
+      </w:pPr>
+      <w:r>
+        <w:rPr/>
+      </w:r>
+    </w:p>
+    <w:p>
+      <w:pPr>
+        <w:pStyle w:val="Normal"/>
+        <w:bidi w:val="0"/>
+        <w:jc w:val="start"/>
+        <w:rPr>
+          <w:b/>
+          <w:bCs/>
+        </w:rPr>
+      </w:pPr>
+      <w:r>
+        <w:rPr>
+          <w:b/>
+          <w:bCs/>
+          <w:u w:val="single"/>
+        </w:rPr>
+        <w:t>InterService Communication Patterns:</w:t>
+      </w:r>
+    </w:p>
+    <w:p>
+      <w:pPr>
+        <w:pStyle w:val="Normal"/>
+        <w:bidi w:val="0"/>
+        <w:jc w:val="start"/>
+        <w:rPr/>
+      </w:pPr>
+      <w:r>
+        <w:rPr/>
+        <w:t>Asynchronous communication or messaging is for Interservice communications. Sometimes, we need to just push a message to a remote system to perform work and you don’t want to wait/block on the downstream system finishing its tasks.</w:t>
+      </w:r>
+    </w:p>
+    <w:p>
+      <w:pPr>
+        <w:pStyle w:val="Normal"/>
+        <w:bidi w:val="0"/>
+        <w:jc w:val="start"/>
+        <w:rPr/>
+      </w:pPr>
+      <w:r>
+        <w:rPr/>
+      </w:r>
+    </w:p>
+    <w:p>
+      <w:pPr>
+        <w:pStyle w:val="Normal"/>
+        <w:bidi w:val="0"/>
+        <w:jc w:val="start"/>
+        <w:rPr/>
+      </w:pPr>
+      <w:r>
+        <w:rPr/>
+      </w:r>
+    </w:p>
+    <w:p>
+      <w:pPr>
+        <w:pStyle w:val="Normal"/>
+        <w:bidi w:val="0"/>
+        <w:jc w:val="start"/>
+        <w:rPr>
+          <w:i/>
+          <w:iCs/>
+        </w:rPr>
+      </w:pPr>
+      <w:r>
+        <w:rPr>
+          <w:i/>
+          <w:iCs/>
+        </w:rPr>
+        <w:t>1.Point to point messaging:</w:t>
+      </w:r>
+    </w:p>
+    <w:p>
+      <w:pPr>
+        <w:pStyle w:val="Normal"/>
+        <w:bidi w:val="0"/>
+        <w:jc w:val="start"/>
+        <w:rPr/>
+      </w:pPr>
+      <w:r>
+        <w:rPr/>
+        <w:t>It is one of the easiest ways in a microservices architecture.</w:t>
+      </w:r>
+    </w:p>
+    <w:p>
+      <w:pPr>
+        <w:pStyle w:val="Normal"/>
+        <w:bidi w:val="0"/>
+        <w:jc w:val="start"/>
+        <w:rPr/>
+      </w:pPr>
+      <w:r>
+        <w:rPr/>
+        <w:t>These can replace traditional RestFul calls between services where response calls are not needed.</w:t>
+      </w:r>
+    </w:p>
+    <w:p>
+      <w:pPr>
+        <w:pStyle w:val="Normal"/>
+        <w:bidi w:val="0"/>
+        <w:jc w:val="start"/>
+        <w:rPr/>
+      </w:pPr>
+      <w:r>
+        <w:rPr/>
+        <w:t>-Single producer that creates a message and puts on message broker</w:t>
+      </w:r>
+    </w:p>
+    <w:p>
+      <w:pPr>
+        <w:pStyle w:val="Normal"/>
+        <w:bidi w:val="0"/>
+        <w:jc w:val="start"/>
+        <w:rPr/>
+      </w:pPr>
+      <w:r>
+        <w:rPr/>
+        <w:t>-Single consumer responds and listens to the message and performs some actions on it</w:t>
+      </w:r>
+    </w:p>
+    <w:p>
+      <w:pPr>
+        <w:pStyle w:val="Normal"/>
+        <w:bidi w:val="0"/>
+        <w:jc w:val="start"/>
+        <w:rPr/>
+      </w:pPr>
+      <w:r>
+        <w:rPr/>
+        <w:t>-It is a Send and forget model. Producer creates a message, dispatches it and goes on.</w:t>
+      </w:r>
+    </w:p>
+    <w:p>
+      <w:pPr>
+        <w:pStyle w:val="Normal"/>
+        <w:bidi w:val="0"/>
+        <w:jc w:val="start"/>
+        <w:rPr/>
+      </w:pPr>
+      <w:r>
+        <w:rPr/>
+        <w:t>Any kind of response is another point-to-point message.</w:t>
+      </w:r>
+    </w:p>
+    <w:p>
+      <w:pPr>
+        <w:pStyle w:val="Normal"/>
+        <w:bidi w:val="0"/>
+        <w:jc w:val="start"/>
+        <w:rPr/>
+      </w:pPr>
+      <w:r>
+        <w:rPr/>
+      </w:r>
+    </w:p>
+    <w:p>
+      <w:pPr>
+        <w:pStyle w:val="Normal"/>
+        <w:bidi w:val="0"/>
+        <w:jc w:val="start"/>
+        <w:rPr/>
+      </w:pPr>
+      <w:r>
+        <w:rPr/>
+        <w:t xml:space="preserve"> </w:t>
+      </w:r>
+    </w:p>
+    <w:p>
+      <w:pPr>
+        <w:pStyle w:val="Normal"/>
+        <w:bidi w:val="0"/>
+        <w:jc w:val="start"/>
+        <w:rPr>
+          <w:i/>
+          <w:iCs/>
+        </w:rPr>
+      </w:pPr>
+      <w:r>
+        <w:rPr>
+          <w:i/>
+          <w:iCs/>
+        </w:rPr>
+        <w:t>2.Publish-Subscribe (PubSub):</w:t>
+      </w:r>
+    </w:p>
+    <w:p>
+      <w:pPr>
+        <w:pStyle w:val="Normal"/>
+        <w:bidi w:val="0"/>
+        <w:jc w:val="start"/>
+        <w:rPr/>
+      </w:pPr>
+      <w:r>
+        <w:rPr/>
+        <w:t>It is a different model for Interservice communications.</w:t>
+      </w:r>
+    </w:p>
+    <w:p>
+      <w:pPr>
+        <w:pStyle w:val="Normal"/>
+        <w:bidi w:val="0"/>
+        <w:jc w:val="start"/>
+        <w:rPr/>
+      </w:pPr>
+      <w:r>
+        <w:rPr/>
+        <w:t>It is a very powerful pattern in distributed computing</w:t>
+      </w:r>
+    </w:p>
+    <w:p>
+      <w:pPr>
+        <w:pStyle w:val="Normal"/>
+        <w:bidi w:val="0"/>
+        <w:jc w:val="start"/>
+        <w:rPr/>
+      </w:pPr>
+      <w:r>
+        <w:rPr/>
+        <w:t>-Single producer who creates the message and dispatches it to the message broker</w:t>
+      </w:r>
+    </w:p>
+    <w:p>
+      <w:pPr>
+        <w:pStyle w:val="Normal"/>
+        <w:bidi w:val="0"/>
+        <w:jc w:val="start"/>
+        <w:rPr/>
+      </w:pPr>
+      <w:r>
+        <w:rPr/>
+        <w:t>-In this model, there is one or more subscribers (one or more consumers) who listen to the messages. You can have multiple consumers of the same message, it is less common as we don’t broadcast the message to many different services with the same exact format.</w:t>
+      </w:r>
+    </w:p>
+    <w:p>
+      <w:pPr>
+        <w:pStyle w:val="Normal"/>
+        <w:bidi w:val="0"/>
+        <w:jc w:val="start"/>
+        <w:rPr/>
+      </w:pPr>
+      <w:r>
+        <w:rPr/>
+        <w:t>-Send and forget model (Producer is not waiting on any kind of response before continuing its work)</w:t>
+      </w:r>
+    </w:p>
+    <w:p>
+      <w:pPr>
+        <w:pStyle w:val="Normal"/>
+        <w:bidi w:val="0"/>
+        <w:jc w:val="start"/>
+        <w:rPr/>
+      </w:pPr>
+      <w:r>
+        <w:rPr/>
+        <w:t>-Durable subscriptions (In traditional pub-sub if a subscriber isn’t there, it wont get the message while if subscriber is durable, it is guaranteed that the message will be delivered at some point once the subscriber is available again)</w:t>
+      </w:r>
+    </w:p>
+    <w:p>
+      <w:pPr>
+        <w:pStyle w:val="Normal"/>
+        <w:bidi w:val="0"/>
+        <w:jc w:val="start"/>
+        <w:rPr/>
+      </w:pPr>
+      <w:r>
+        <w:rPr/>
+      </w:r>
+    </w:p>
+    <w:p>
+      <w:pPr>
+        <w:pStyle w:val="Normal"/>
+        <w:bidi w:val="0"/>
+        <w:jc w:val="start"/>
+        <w:rPr/>
+      </w:pPr>
+      <w:r>
+        <w:rPr/>
+      </w:r>
+    </w:p>
+    <w:p>
+      <w:pPr>
+        <w:pStyle w:val="Normal"/>
+        <w:bidi w:val="0"/>
+        <w:jc w:val="start"/>
+        <w:rPr/>
+      </w:pPr>
+      <w:r>
+        <w:rPr/>
+      </w:r>
+    </w:p>
+    <w:p>
+      <w:pPr>
+        <w:pStyle w:val="Normal"/>
+        <w:bidi w:val="0"/>
+        <w:jc w:val="start"/>
+        <w:rPr>
+          <w:i/>
+          <w:iCs/>
+        </w:rPr>
+      </w:pPr>
+      <w:r>
+        <w:rPr>
+          <w:i/>
+          <w:iCs/>
+        </w:rPr>
+        <w:t>Point-to-point asynchronous messaging:</w:t>
+      </w:r>
+    </w:p>
+    <w:p>
+      <w:pPr>
+        <w:pStyle w:val="Normal"/>
+        <w:bidi w:val="0"/>
+        <w:jc w:val="start"/>
+        <w:rPr/>
+      </w:pPr>
+      <w:r>
+        <w:rPr/>
+        <w:t>When would you use it and how would you construct it?</w:t>
+      </w:r>
+    </w:p>
+    <w:p>
+      <w:pPr>
+        <w:pStyle w:val="Normal"/>
+        <w:bidi w:val="0"/>
+        <w:jc w:val="start"/>
+        <w:rPr/>
+      </w:pPr>
+      <w:r>
+        <w:rPr/>
+        <w:t>Use cases:</w:t>
+      </w:r>
+    </w:p>
+    <w:p>
+      <w:pPr>
+        <w:pStyle w:val="Normal"/>
+        <w:bidi w:val="0"/>
+        <w:jc w:val="start"/>
+        <w:rPr/>
+      </w:pPr>
+      <w:r>
+        <w:rPr/>
+        <w:t>1.When no response is needed from the Consumer (in that case, we can produce the message and no need to wait until the task is done. Audit system is another example where we send a message to the audit system and wait for no response)</w:t>
+      </w:r>
+    </w:p>
+    <w:p>
+      <w:pPr>
+        <w:pStyle w:val="Normal"/>
+        <w:bidi w:val="0"/>
+        <w:jc w:val="start"/>
+        <w:rPr/>
+      </w:pPr>
+      <w:r>
+        <w:rPr/>
+        <w:t>2.Admin task: Cleanup operations on aggregated data that was denormalized for efficiencies in RDBMS.</w:t>
+      </w:r>
+    </w:p>
+    <w:p>
+      <w:pPr>
+        <w:pStyle w:val="Normal"/>
+        <w:bidi w:val="0"/>
+        <w:jc w:val="start"/>
+        <w:rPr/>
+      </w:pPr>
+      <w:r>
+        <w:rPr/>
+        <w:t>3.Out of band processes: sending an email, which is asynchronous and doesn’t guarantee a delivery. Producer would put on a queue and my communication service will pick it up and send the email.</w:t>
+      </w:r>
+    </w:p>
+    <w:p>
+      <w:pPr>
+        <w:pStyle w:val="Normal"/>
+        <w:bidi w:val="0"/>
+        <w:jc w:val="start"/>
+        <w:rPr/>
+      </w:pPr>
+      <w:r>
+        <w:rPr/>
+        <w:t>4.Scaling your system: By isolating the jobs, we can scale them individually due to asynchronous messaging. Wait and see system hinders scaling.</w:t>
+      </w:r>
+    </w:p>
+    <w:p>
+      <w:pPr>
+        <w:pStyle w:val="Normal"/>
+        <w:bidi w:val="0"/>
+        <w:jc w:val="start"/>
+        <w:rPr/>
+      </w:pPr>
+      <w:r>
+        <w:rPr/>
+      </w:r>
+    </w:p>
+    <w:p>
+      <w:pPr>
+        <w:pStyle w:val="Normal"/>
+        <w:bidi w:val="0"/>
+        <w:jc w:val="start"/>
+        <w:rPr/>
+      </w:pPr>
+      <w:r>
+        <w:rPr/>
+      </w:r>
+    </w:p>
+    <w:p>
+      <w:pPr>
+        <w:pStyle w:val="Normal"/>
+        <w:bidi w:val="0"/>
+        <w:jc w:val="start"/>
+        <w:rPr/>
+      </w:pPr>
+      <w:r>
+        <w:rPr/>
+        <w:t>Producer ====&gt; Message broker =====&gt; Consumer</w:t>
+      </w:r>
+    </w:p>
+    <w:p>
+      <w:pPr>
+        <w:pStyle w:val="Normal"/>
+        <w:bidi w:val="0"/>
+        <w:jc w:val="start"/>
+        <w:rPr/>
+      </w:pPr>
+      <w:r>
+        <w:rPr/>
+      </w:r>
+    </w:p>
+    <w:p>
+      <w:pPr>
+        <w:pStyle w:val="Normal"/>
+        <w:bidi w:val="0"/>
+        <w:jc w:val="start"/>
+        <w:rPr/>
+      </w:pPr>
+      <w:r>
+        <w:rPr/>
+        <w:t>Message broker is the heart of the system. Usually the real heavy lifting is in Consumer. Consumer attaches to the Message broker and actively pulls from the Message broker. Consumer goes into the idle state until the next polling time triggers for the message to be listened for. Original service makes a call to the Producer and blocks, waiting for a response from the Producer. Producer creates a message based on the contract and puts it on the Message broker. At this point, the Producer returns as Accepted Status to the original Service. Message broker will present the Message. Consumer in the next listen phase based on polling will pull the Message from Message broker and send Ack to Message broker.</w:t>
+      </w:r>
+    </w:p>
+    <w:p>
+      <w:pPr>
+        <w:pStyle w:val="Normal"/>
+        <w:bidi w:val="0"/>
+        <w:jc w:val="start"/>
+        <w:rPr/>
+      </w:pPr>
+      <w:r>
+        <w:rPr/>
+      </w:r>
+    </w:p>
+    <w:p>
+      <w:pPr>
+        <w:pStyle w:val="Normal"/>
+        <w:bidi w:val="0"/>
+        <w:jc w:val="start"/>
+        <w:rPr/>
+      </w:pPr>
+      <w:r>
+        <w:rPr/>
+      </w:r>
+    </w:p>
+    <w:p>
+      <w:pPr>
+        <w:pStyle w:val="Normal"/>
+        <w:bidi w:val="0"/>
+        <w:jc w:val="start"/>
+        <w:rPr>
+          <w:u w:val="single"/>
+        </w:rPr>
+      </w:pPr>
+      <w:r>
+        <w:rPr>
+          <w:u w:val="single"/>
+        </w:rPr>
+        <w:t>Point to point Considerations:</w:t>
+      </w:r>
+    </w:p>
+    <w:p>
+      <w:pPr>
+        <w:pStyle w:val="Normal"/>
+        <w:bidi w:val="0"/>
+        <w:jc w:val="start"/>
+        <w:rPr/>
+      </w:pPr>
+      <w:r>
+        <w:rPr/>
+        <w:t>1.Wire time: If the act of building the message, setting up connection to the Message broker, sending a Message to Message broker takes as long as or more than just making the downstream call, are we really saving time?</w:t>
+      </w:r>
+    </w:p>
+    <w:p>
+      <w:pPr>
+        <w:pStyle w:val="Normal"/>
+        <w:bidi w:val="0"/>
+        <w:jc w:val="start"/>
+        <w:rPr/>
+      </w:pPr>
+      <w:r>
+        <w:rPr/>
+        <w:t>2.Extra components:  if complexity of adding more components reduces processing time then it is ok</w:t>
+      </w:r>
+    </w:p>
+    <w:p>
+      <w:pPr>
+        <w:pStyle w:val="Normal"/>
+        <w:bidi w:val="0"/>
+        <w:jc w:val="start"/>
+        <w:rPr/>
+      </w:pPr>
+      <w:r>
+        <w:rPr/>
+        <w:t>3.Plan for failure scenarios: Use the Dead Letter Queue (DLQ). Inspect DLQ and ensure we are not getting (failure) messages there.</w:t>
+      </w:r>
+    </w:p>
+    <w:p>
+      <w:pPr>
+        <w:pStyle w:val="Normal"/>
+        <w:bidi w:val="0"/>
+        <w:jc w:val="start"/>
+        <w:rPr/>
+      </w:pPr>
+      <w:r>
+        <w:rPr/>
+      </w:r>
+    </w:p>
+    <w:p>
+      <w:pPr>
+        <w:pStyle w:val="Normal"/>
+        <w:bidi w:val="0"/>
+        <w:jc w:val="start"/>
+        <w:rPr/>
+      </w:pPr>
+      <w:r>
+        <w:rPr/>
+      </w:r>
+    </w:p>
+    <w:p>
+      <w:pPr>
+        <w:pStyle w:val="Normal"/>
+        <w:bidi w:val="0"/>
+        <w:jc w:val="start"/>
+        <w:rPr/>
+      </w:pPr>
+      <w:r>
+        <w:rPr/>
+      </w:r>
+    </w:p>
+    <w:p>
+      <w:pPr>
+        <w:pStyle w:val="Normal"/>
+        <w:bidi w:val="0"/>
+        <w:jc w:val="start"/>
+        <w:rPr>
+          <w:i/>
+          <w:iCs/>
+        </w:rPr>
+      </w:pPr>
+      <w:r>
+        <w:rPr>
+          <w:i/>
+          <w:iCs/>
+        </w:rPr>
+        <w:t>Publish-Subscribe asynchronous messaging:</w:t>
+      </w:r>
+    </w:p>
+    <w:p>
+      <w:pPr>
+        <w:pStyle w:val="Normal"/>
+        <w:bidi w:val="0"/>
+        <w:jc w:val="start"/>
+        <w:rPr/>
+      </w:pPr>
+      <w:r>
+        <w:rPr/>
+        <w:t>Use cases</w:t>
+      </w:r>
+    </w:p>
+    <w:p>
+      <w:pPr>
+        <w:pStyle w:val="Normal"/>
+        <w:bidi w:val="0"/>
+        <w:jc w:val="start"/>
+        <w:rPr/>
+      </w:pPr>
+      <w:r>
+        <w:rPr/>
+        <w:t>Multiple responders: In Distributed computing, between data centers, you can have triggered actions within each data center to occur in isolation. Those triggers are often admin tasks like triggers to clean up or update search indices. In Pub/Sub model, the central hub can publish the message and a worker in each data center can subscribe to the message. When a new data center comes online, there is no code changes needed, a new data center creates a new Consumer and subscribes to get the messages every other data center gets.</w:t>
+      </w:r>
+    </w:p>
+    <w:p>
+      <w:pPr>
+        <w:pStyle w:val="Normal"/>
+        <w:bidi w:val="0"/>
+        <w:jc w:val="start"/>
+        <w:rPr/>
+      </w:pPr>
+      <w:r>
+        <w:rPr/>
+        <w:t>Multiple tasks: when a Consumer asked for a copy of his/her data or asked to be forgotten, we would publish a message to the Message broker. Each department would then listen for those messages and perform their own series of actions to handle the consumer’s request. When they were done, they would put a Point-to-point message on a queue and we would then wait until everyone else responded before moving on to the next step. No code changes on the Pub/Sub side, we continued messages putting on the queue.</w:t>
+      </w:r>
+    </w:p>
+    <w:p>
+      <w:pPr>
+        <w:pStyle w:val="Normal"/>
+        <w:bidi w:val="0"/>
+        <w:jc w:val="start"/>
+        <w:rPr/>
+      </w:pPr>
+      <w:r>
+        <w:rPr/>
+        <w:t>Consumer choice: The fanout works similar to Pub/Sub. The key here is, you can create messages that everyone or no one will listen to without any code changes. When there is more consumers, they will just subscribe.</w:t>
+      </w:r>
+    </w:p>
+    <w:p>
+      <w:pPr>
+        <w:pStyle w:val="Normal"/>
+        <w:bidi w:val="0"/>
+        <w:jc w:val="start"/>
+        <w:rPr/>
+      </w:pPr>
+      <w:r>
+        <w:rPr/>
+      </w:r>
+    </w:p>
+    <w:p>
+      <w:pPr>
+        <w:pStyle w:val="Normal"/>
+        <w:bidi w:val="0"/>
+        <w:jc w:val="start"/>
+        <w:rPr/>
+      </w:pPr>
+      <w:r>
+        <w:rPr/>
+      </w:r>
+    </w:p>
+    <w:p>
+      <w:pPr>
+        <w:pStyle w:val="Normal"/>
+        <w:bidi w:val="0"/>
+        <w:jc w:val="start"/>
+        <w:rPr/>
+      </w:pPr>
+      <w:r>
+        <w:rPr/>
+      </w:r>
+    </w:p>
+    <w:p>
+      <w:pPr>
+        <w:pStyle w:val="Normal"/>
+        <w:bidi w:val="0"/>
+        <w:jc w:val="start"/>
+        <w:rPr>
+          <w:i/>
+          <w:iCs/>
+        </w:rPr>
+      </w:pPr>
+      <w:r>
+        <w:rPr>
+          <w:i/>
+          <w:iCs/>
+        </w:rPr>
+        <w:t>Durable subscribers:</w:t>
+      </w:r>
+    </w:p>
+    <w:p>
+      <w:pPr>
+        <w:pStyle w:val="Normal"/>
+        <w:bidi w:val="0"/>
+        <w:jc w:val="start"/>
+        <w:rPr/>
+      </w:pPr>
+      <w:r>
+        <w:rPr/>
+        <w:t>1.Always get the message:</w:t>
+      </w:r>
+    </w:p>
+    <w:p>
+      <w:pPr>
+        <w:pStyle w:val="Normal"/>
+        <w:bidi w:val="0"/>
+        <w:jc w:val="start"/>
+        <w:rPr/>
+      </w:pPr>
+      <w:r>
+        <w:rPr/>
+        <w:t>The Message broker will learn about the Durable subscriber and keep the message around until that Subscriber acknowledges it without impacting other Subscribers.</w:t>
+      </w:r>
+    </w:p>
+    <w:p>
+      <w:pPr>
+        <w:pStyle w:val="Normal"/>
+        <w:bidi w:val="0"/>
+        <w:jc w:val="start"/>
+        <w:rPr/>
+      </w:pPr>
+      <w:r>
+        <w:rPr/>
+        <w:t>2.This operation becomes Powerful in Mission-critical operations:</w:t>
+      </w:r>
+    </w:p>
+    <w:p>
+      <w:pPr>
+        <w:pStyle w:val="Normal"/>
+        <w:bidi w:val="0"/>
+        <w:jc w:val="start"/>
+        <w:rPr/>
+      </w:pPr>
+      <w:r>
+        <w:rPr/>
+        <w:t>Lets say we have a legal obligation to process the data but at the same time don’t want to Block or Retry if remote system was down for some reason. Simply we can have the Message brokers to send messages when the Consumers come back online.</w:t>
+      </w:r>
+    </w:p>
+    <w:p>
+      <w:pPr>
+        <w:pStyle w:val="Normal"/>
+        <w:bidi w:val="0"/>
+        <w:jc w:val="start"/>
+        <w:rPr/>
+      </w:pPr>
+      <w:r>
+        <w:rPr/>
+        <w:t>3.Unregister if needed:</w:t>
+      </w:r>
+    </w:p>
+    <w:p>
+      <w:pPr>
+        <w:pStyle w:val="Normal"/>
+        <w:bidi w:val="0"/>
+        <w:jc w:val="start"/>
+        <w:rPr/>
+      </w:pPr>
+      <w:r>
+        <w:rPr/>
+        <w:t>If Consumer no longer needs to consumer the messages, they must unregister to ensure the Message broker doesn’t hang on to the messages that are no longer needed.</w:t>
+      </w:r>
+    </w:p>
+    <w:p>
+      <w:pPr>
+        <w:pStyle w:val="Normal"/>
+        <w:bidi w:val="0"/>
+        <w:jc w:val="start"/>
+        <w:rPr/>
+      </w:pPr>
+      <w:r>
+        <w:rPr/>
+        <w:t>4.Producer agnostic:</w:t>
+      </w:r>
+    </w:p>
+    <w:p>
+      <w:pPr>
+        <w:pStyle w:val="Normal"/>
+        <w:bidi w:val="0"/>
+        <w:jc w:val="start"/>
+        <w:rPr/>
+      </w:pPr>
+      <w:r>
+        <w:rPr/>
+        <w:t>The Producer doesn’t need to know the Consumers (not even durable or not). They are completely decoupled.</w:t>
+      </w:r>
+    </w:p>
+    <w:p>
+      <w:pPr>
+        <w:pStyle w:val="Normal"/>
+        <w:bidi w:val="0"/>
+        <w:jc w:val="start"/>
+        <w:rPr/>
+      </w:pPr>
+      <w:r>
+        <w:rPr/>
+      </w:r>
+    </w:p>
+    <w:p>
+      <w:pPr>
+        <w:pStyle w:val="Normal"/>
+        <w:bidi w:val="0"/>
+        <w:jc w:val="start"/>
+        <w:rPr/>
+      </w:pPr>
+      <w:r>
+        <w:rPr/>
+      </w:r>
+    </w:p>
+    <w:p>
+      <w:pPr>
+        <w:pStyle w:val="Normal"/>
+        <w:bidi w:val="0"/>
+        <w:jc w:val="start"/>
+        <w:rPr/>
+      </w:pPr>
+      <w:r>
+        <w:rPr/>
+      </w:r>
+    </w:p>
+    <w:p>
+      <w:pPr>
+        <w:pStyle w:val="Normal"/>
+        <w:bidi w:val="0"/>
+        <w:jc w:val="start"/>
+        <w:rPr>
+          <w:u w:val="single"/>
+        </w:rPr>
+      </w:pPr>
+      <w:r>
+        <w:rPr>
+          <w:u w:val="single"/>
+        </w:rPr>
+        <w:t>Publish-Subscribe model</w:t>
+      </w:r>
+    </w:p>
+    <w:p>
+      <w:pPr>
+        <w:pStyle w:val="Normal"/>
+        <w:bidi w:val="0"/>
+        <w:jc w:val="start"/>
+        <w:rPr/>
+      </w:pPr>
+      <w:r>
+        <w:rPr/>
+      </w:r>
+    </w:p>
+    <w:p>
+      <w:pPr>
+        <w:pStyle w:val="Normal"/>
+        <w:bidi w:val="0"/>
+        <w:jc w:val="start"/>
+        <w:rPr/>
+      </w:pPr>
+      <w:r>
+        <w:rPr/>
+      </w:r>
+    </w:p>
+    <w:p>
+      <w:pPr>
+        <w:pStyle w:val="Normal"/>
+        <w:bidi w:val="0"/>
+        <w:jc w:val="start"/>
+        <w:rPr/>
+      </w:pPr>
+      <w:r>
+        <w:rPr/>
+        <w:t>Producer ====&gt; Message broker ====&gt; Subscriber1, and Subscriber2</w:t>
+      </w:r>
+    </w:p>
+    <w:p>
+      <w:pPr>
+        <w:pStyle w:val="Normal"/>
+        <w:bidi w:val="0"/>
+        <w:jc w:val="start"/>
+        <w:rPr/>
+      </w:pPr>
+      <w:r>
+        <w:rPr/>
+      </w:r>
+    </w:p>
+    <w:p>
+      <w:pPr>
+        <w:pStyle w:val="Normal"/>
+        <w:bidi w:val="0"/>
+        <w:jc w:val="start"/>
+        <w:rPr/>
+      </w:pPr>
+      <w:r>
+        <w:rPr/>
+        <w:drawing>
+          <wp:anchor distT="0" distB="0" distL="0" distR="0" simplePos="0" relativeHeight="2" behindDoc="0" locked="0" layoutInCell="0" allowOverlap="1">
+            <wp:simplePos x="0" y="0"/>
+            <wp:positionH relativeFrom="column">
+              <wp:align>center</wp:align>
+            </wp:positionH>
+            <wp:positionV relativeFrom="paragraph">
+              <wp:posOffset>635</wp:posOffset>
+            </wp:positionV>
+            <wp:extent cx="5799455" cy="2217420"/>
+            <wp:effectExtent l="0" t="0" r="0" b="0"/>
+            <wp:wrapSquare wrapText="largest"/>
+            <wp:docPr id="1" name="Image1"/>
+            <wp:cNvGraphicFramePr>
+              <a:graphicFrameLocks xmlns:a="http://schemas.openxmlformats.org/drawingml/2006/main" noChangeAspect="1"/>
+            </wp:cNvGraphicFramePr>
+            <a:graphic xmlns:a="http://schemas.openxmlformats.org/drawingml/2006/main">
+              <a:graphicData uri="http://schemas.openxmlformats.org/drawingml/2006/picture">
+                <pic:pic xmlns:pic="http://schemas.openxmlformats.org/drawingml/2006/picture">
+                  <pic:nvPicPr>
+                    <pic:cNvPr id="1" name="Image1"/>
+                    <pic:cNvPicPr>
+                      <a:picLocks noChangeAspect="1" noChangeArrowheads="1"/>
+                    </pic:cNvPicPr>
+                  </pic:nvPicPr>
+                  <pic:blipFill>
+                    <a:blip r:embed="rId2"/>
+                    <a:stretch>
+                      <a:fillRect/>
+                    </a:stretch>
+                  </pic:blipFill>
+                  <pic:spPr bwMode="auto">
+                    <a:xfrm>
+                      <a:off x="0" y="0"/>
+                      <a:ext cx="5799455" cy="2217420"/>
+                    </a:xfrm>
+                    <a:prstGeom prst="rect">
+                      <a:avLst/>
+                    </a:prstGeom>
+                    <a:noFill/>
+                  </pic:spPr>
+                </pic:pic>
+              </a:graphicData>
+            </a:graphic>
+          </wp:anchor>
+        </w:drawing>
+      </w:r>
+    </w:p>
+    <w:p>
+      <w:pPr>
+        <w:pStyle w:val="Normal"/>
+        <w:bidi w:val="0"/>
+        <w:jc w:val="start"/>
+        <w:rPr/>
+      </w:pPr>
+      <w:r>
+        <w:rPr/>
+      </w:r>
+    </w:p>
+    <w:p>
+      <w:pPr>
+        <w:pStyle w:val="Normal"/>
+        <w:bidi w:val="0"/>
+        <w:jc w:val="start"/>
+        <w:rPr/>
+      </w:pPr>
+      <w:r>
+        <w:rPr/>
+      </w:r>
+    </w:p>
+    <w:p>
+      <w:pPr>
+        <w:pStyle w:val="Normal"/>
+        <w:bidi w:val="0"/>
+        <w:jc w:val="start"/>
+        <w:rPr/>
+      </w:pPr>
+      <w:r>
+        <w:rPr/>
+      </w:r>
+    </w:p>
+    <w:p>
+      <w:pPr>
+        <w:pStyle w:val="Normal"/>
+        <w:bidi w:val="0"/>
+        <w:jc w:val="start"/>
+        <w:rPr/>
+      </w:pPr>
+      <w:r>
+        <w:rPr/>
+      </w:r>
+    </w:p>
+    <w:p>
+      <w:pPr>
+        <w:pStyle w:val="Normal"/>
+        <w:bidi w:val="0"/>
+        <w:jc w:val="start"/>
+        <w:rPr/>
+      </w:pPr>
+      <w:r>
+        <w:rPr/>
+      </w:r>
+    </w:p>
+    <w:p>
+      <w:pPr>
+        <w:pStyle w:val="Normal"/>
+        <w:bidi w:val="0"/>
+        <w:jc w:val="start"/>
+        <w:rPr/>
+      </w:pPr>
+      <w:r>
+        <w:rPr/>
+      </w:r>
+    </w:p>
+    <w:p>
+      <w:pPr>
+        <w:pStyle w:val="Normal"/>
+        <w:bidi w:val="0"/>
+        <w:jc w:val="start"/>
+        <w:rPr/>
+      </w:pPr>
+      <w:r>
+        <w:rPr/>
+      </w:r>
+    </w:p>
+    <w:p>
+      <w:pPr>
+        <w:pStyle w:val="Normal"/>
+        <w:bidi w:val="0"/>
+        <w:jc w:val="start"/>
+        <w:rPr/>
+      </w:pPr>
+      <w:r>
+        <w:rPr/>
+      </w:r>
+    </w:p>
+    <w:p>
+      <w:pPr>
+        <w:pStyle w:val="Normal"/>
+        <w:bidi w:val="0"/>
+        <w:jc w:val="start"/>
+        <w:rPr/>
+      </w:pPr>
+      <w:r>
+        <w:rPr/>
+      </w:r>
+    </w:p>
+    <w:p>
+      <w:pPr>
+        <w:pStyle w:val="Normal"/>
+        <w:bidi w:val="0"/>
+        <w:jc w:val="start"/>
+        <w:rPr/>
+      </w:pPr>
+      <w:r>
+        <w:rPr/>
+      </w:r>
+    </w:p>
+    <w:p>
+      <w:pPr>
+        <w:pStyle w:val="Normal"/>
+        <w:bidi w:val="0"/>
+        <w:jc w:val="start"/>
+        <w:rPr/>
+      </w:pPr>
+      <w:r>
+        <w:rPr/>
+      </w:r>
+    </w:p>
+    <w:p>
+      <w:pPr>
+        <w:pStyle w:val="Normal"/>
+        <w:bidi w:val="0"/>
+        <w:jc w:val="start"/>
+        <w:rPr/>
+      </w:pPr>
+      <w:r>
+        <w:rPr/>
+      </w:r>
+    </w:p>
+    <w:p>
+      <w:pPr>
+        <w:pStyle w:val="Normal"/>
+        <w:bidi w:val="0"/>
+        <w:jc w:val="start"/>
+        <w:rPr/>
+      </w:pPr>
+      <w:r>
+        <w:rPr/>
+      </w:r>
+    </w:p>
+    <w:p>
+      <w:pPr>
+        <w:pStyle w:val="Normal"/>
+        <w:bidi w:val="0"/>
+        <w:jc w:val="start"/>
+        <w:rPr/>
+      </w:pPr>
+      <w:r>
+        <w:rPr/>
+      </w:r>
+    </w:p>
+    <w:p>
+      <w:pPr>
+        <w:pStyle w:val="Normal"/>
+        <w:bidi w:val="0"/>
+        <w:jc w:val="start"/>
+        <w:rPr/>
+      </w:pPr>
+      <w:r>
+        <w:rPr/>
+        <w:t>Producer will be called Synchronously by some Service using RestFul messages. The RestFul messages will come in and start the process. Say we have two Subscribers in the downstream process to act on the message. Each of the Subscribers, subscribes to the messages and starts the pulling process. Message broker also knows currently there are two subscribers for the messages. The Producer creates a message based on the contract and puts on the broker. Then Producer responds back to the original caller service with an Accepted Status code. Message will move to the Message broker and be put on the appropriate queue. It will present message to all available Subscribers. The Subscribers on their own independent listen phase will receive the message in original format. Each subscriber should act on the message on their own while Message broker holds the message.</w:t>
+      </w:r>
+    </w:p>
+    <w:p>
+      <w:pPr>
+        <w:pStyle w:val="Normal"/>
+        <w:bidi w:val="0"/>
+        <w:jc w:val="start"/>
+        <w:rPr/>
+      </w:pPr>
+      <w:r>
+        <w:rPr/>
+      </w:r>
+    </w:p>
+    <w:p>
+      <w:pPr>
+        <w:pStyle w:val="Normal"/>
+        <w:bidi w:val="0"/>
+        <w:jc w:val="start"/>
+        <w:rPr/>
+      </w:pPr>
+      <w:r>
+        <w:rPr/>
+      </w:r>
+    </w:p>
+    <w:p>
+      <w:pPr>
+        <w:pStyle w:val="Normal"/>
+        <w:bidi w:val="0"/>
+        <w:jc w:val="start"/>
+        <w:rPr/>
+      </w:pPr>
+      <w:r>
+        <w:rPr/>
+      </w:r>
+    </w:p>
+    <w:p>
+      <w:pPr>
+        <w:pStyle w:val="Normal"/>
+        <w:bidi w:val="0"/>
+        <w:jc w:val="start"/>
+        <w:rPr/>
+      </w:pPr>
+      <w:r>
+        <w:rPr/>
+      </w:r>
+    </w:p>
+    <w:p>
+      <w:pPr>
+        <w:pStyle w:val="Normal"/>
+        <w:bidi w:val="0"/>
+        <w:jc w:val="start"/>
+        <w:rPr>
+          <w:u w:val="single"/>
+        </w:rPr>
+      </w:pPr>
+      <w:r>
+        <w:rPr>
+          <w:u w:val="single"/>
+        </w:rPr>
+      </w:r>
+    </w:p>
+    <w:p>
+      <w:pPr>
+        <w:pStyle w:val="Normal"/>
+        <w:bidi w:val="0"/>
+        <w:jc w:val="start"/>
+        <w:rPr>
+          <w:u w:val="single"/>
+        </w:rPr>
+      </w:pPr>
+      <w:r>
+        <w:rPr>
+          <w:u w:val="single"/>
+        </w:rPr>
+      </w:r>
+    </w:p>
+    <w:p>
+      <w:pPr>
+        <w:pStyle w:val="Normal"/>
+        <w:bidi w:val="0"/>
+        <w:jc w:val="start"/>
+        <w:rPr>
+          <w:u w:val="single"/>
+        </w:rPr>
+      </w:pPr>
+      <w:r>
+        <w:rPr>
+          <w:u w:val="single"/>
+        </w:rPr>
+      </w:r>
+    </w:p>
+    <w:p>
+      <w:pPr>
+        <w:pStyle w:val="Normal"/>
+        <w:bidi w:val="0"/>
+        <w:jc w:val="start"/>
+        <w:rPr>
+          <w:u w:val="single"/>
+        </w:rPr>
+      </w:pPr>
+      <w:r>
+        <w:rPr>
+          <w:u w:val="single"/>
+        </w:rPr>
+      </w:r>
+    </w:p>
+    <w:p>
+      <w:pPr>
+        <w:pStyle w:val="Normal"/>
+        <w:bidi w:val="0"/>
+        <w:jc w:val="start"/>
+        <w:rPr>
+          <w:u w:val="single"/>
+        </w:rPr>
+      </w:pPr>
+      <w:r>
+        <w:rPr>
+          <w:u w:val="single"/>
+        </w:rPr>
+        <w:t>Event-Driven Microservices:</w:t>
+      </w:r>
+    </w:p>
+    <w:p>
+      <w:pPr>
+        <w:pStyle w:val="Normal"/>
+        <w:bidi w:val="0"/>
+        <w:jc w:val="start"/>
+        <w:rPr/>
+      </w:pPr>
+      <w:r>
+        <w:rPr/>
+      </w:r>
+    </w:p>
+    <w:p>
+      <w:pPr>
+        <w:pStyle w:val="Normal"/>
+        <w:bidi w:val="0"/>
+        <w:jc w:val="start"/>
+        <w:rPr/>
+      </w:pPr>
+      <w:r>
+        <w:rPr/>
+      </w:r>
+    </w:p>
+    <w:p>
+      <w:pPr>
+        <w:pStyle w:val="Normal"/>
+        <w:bidi w:val="0"/>
+        <w:jc w:val="start"/>
+        <w:rPr/>
+      </w:pPr>
+      <w:r>
+        <w:rPr/>
+      </w:r>
+    </w:p>
+    <w:p>
+      <w:pPr>
+        <w:pStyle w:val="Normal"/>
+        <w:bidi w:val="0"/>
+        <w:jc w:val="start"/>
+        <w:rPr/>
+      </w:pPr>
+      <w:r>
+        <w:rPr/>
       </w:r>
     </w:p>
     <w:p>
@@ -1994,6 +3304,7 @@
       <w:pgNumType w:fmt="decimal"/>
       <w:formProt w:val="false"/>
       <w:textDirection w:val="lrTb"/>
+      <w:docGrid w:type="default" w:linePitch="100" w:charSpace="0"/>
     </w:sectPr>
   </w:body>
 </w:document>
@@ -2013,7 +3324,6 @@
     </w:rPrDefault>
     <w:pPrDefault>
       <w:pPr>
-        <w:widowControl/>
         <w:suppressAutoHyphens w:val="true"/>
       </w:pPr>
     </w:pPrDefault>
@@ -2023,7 +3333,10 @@
     <w:qFormat/>
     <w:pPr>
       <w:widowControl/>
+      <w:suppressAutoHyphens w:val="true"/>
       <w:bidi w:val="0"/>
+      <w:spacing w:before="0" w:after="0"/>
+      <w:jc w:val="start"/>
     </w:pPr>
     <w:rPr>
       <w:rFonts w:ascii="Liberation Serif" w:hAnsi="Liberation Serif" w:eastAsia="NSimSun" w:cs="Lucida Sans"/>
@@ -2098,6 +3411,13 @@
     <w:rPr>
       <w:rFonts w:cs="Lucida Sans"/>
     </w:rPr>
+  </w:style>
+  <w:style w:type="paragraph" w:styleId="FrameContentsuser">
+    <w:name w:val="Frame Contents (user)"/>
+    <w:basedOn w:val="Normal"/>
+    <w:qFormat/>
+    <w:pPr/>
+    <w:rPr/>
   </w:style>
 </w:styles>
 </file>

</xml_diff>

<commit_message>
SystemDesign: Event-Driven MS pattern
</commit_message>
<xml_diff>
--- a/Microservices/Microservices_AsyncMessaging.docx
+++ b/Microservices/Microservices_AsyncMessaging.docx
@@ -3060,6 +3060,1135 @@
       <w:r>
         <w:rPr/>
         <w:t>much like a dance choreography</w:t>
+      </w:r>
+    </w:p>
+    <w:p>
+      <w:pPr>
+        <w:pStyle w:val="Normal"/>
+        <w:bidi w:val="0"/>
+        <w:jc w:val="start"/>
+        <w:rPr/>
+      </w:pPr>
+      <w:r>
+        <w:rPr/>
+      </w:r>
+    </w:p>
+    <w:p>
+      <w:pPr>
+        <w:pStyle w:val="Normal"/>
+        <w:bidi w:val="0"/>
+        <w:jc w:val="start"/>
+        <w:rPr/>
+      </w:pPr>
+      <w:r>
+        <w:rPr/>
+        <w:t>Choreographer is the initializer trigger event. Then each step is on its own from there onwards.</w:t>
+      </w:r>
+    </w:p>
+    <w:p>
+      <w:pPr>
+        <w:pStyle w:val="Normal"/>
+        <w:bidi w:val="0"/>
+        <w:jc w:val="start"/>
+        <w:rPr/>
+      </w:pPr>
+      <w:r>
+        <w:rPr/>
+      </w:r>
+    </w:p>
+    <w:p>
+      <w:pPr>
+        <w:pStyle w:val="Normal"/>
+        <w:bidi w:val="0"/>
+        <w:jc w:val="start"/>
+        <w:rPr/>
+      </w:pPr>
+      <w:r>
+        <w:rPr/>
+        <w:t>Use-cases:</w:t>
+      </w:r>
+    </w:p>
+    <w:p>
+      <w:pPr>
+        <w:pStyle w:val="Normal"/>
+        <w:bidi w:val="0"/>
+        <w:jc w:val="start"/>
+        <w:rPr/>
+      </w:pPr>
+      <w:r>
+        <w:rPr/>
+        <w:t>1.Distinct systems:</w:t>
+      </w:r>
+    </w:p>
+    <w:p>
+      <w:pPr>
+        <w:pStyle w:val="Normal"/>
+        <w:bidi w:val="0"/>
+        <w:jc w:val="start"/>
+        <w:rPr/>
+      </w:pPr>
+      <w:r>
+        <w:rPr/>
+        <w:t>Initial event execution will trigger the remote system to start its own event chain. The events may trigger other systems. In the context of async messaging and choreographed events, distinct systems are independent microservices or applications that communicate through shared events rather than direct API calls. Instead of one central system "orchestrating" every step, each system acts autonomously, listening for events it cares about and emitting new ones when it completes a task.</w:t>
+      </w:r>
+    </w:p>
+    <w:p>
+      <w:pPr>
+        <w:pStyle w:val="Normal"/>
+        <w:bidi w:val="0"/>
+        <w:jc w:val="start"/>
+        <w:rPr/>
+      </w:pPr>
+      <w:r>
+        <w:rPr/>
+        <w:t>2.Alternative cascades:</w:t>
+      </w:r>
+    </w:p>
+    <w:p>
+      <w:pPr>
+        <w:pStyle w:val="Normal"/>
+        <w:bidi w:val="0"/>
+        <w:jc w:val="start"/>
+        <w:rPr/>
+      </w:pPr>
+      <w:r>
+        <w:rPr/>
+        <w:t>Each step may have results that trigger more than one next step. As such, the choreography sets the wheels in motion. In a choreographed event-driven architecture, an alternative cascade is an asynchronous fallback mechanism. If a primary event-driven workflow fails or is rejected, the system triggers a secondary, alternative sequence of events to gracefully resolve the issue, bypassing the need for a central orchestrator.</w:t>
+      </w:r>
+    </w:p>
+    <w:p>
+      <w:pPr>
+        <w:pStyle w:val="Normal"/>
+        <w:bidi w:val="0"/>
+        <w:jc w:val="start"/>
+        <w:rPr/>
+      </w:pPr>
+      <w:r>
+        <w:rPr/>
+      </w:r>
+    </w:p>
+    <w:p>
+      <w:pPr>
+        <w:pStyle w:val="Normal"/>
+        <w:bidi w:val="0"/>
+        <w:jc w:val="start"/>
+        <w:rPr/>
+      </w:pPr>
+      <w:r>
+        <w:rPr/>
+        <w:t xml:space="preserve">Event Producer ===&gt; Message broker ===&gt; Step1, Step2, Step3 all unique </w:t>
+      </w:r>
+    </w:p>
+    <w:p>
+      <w:pPr>
+        <w:pStyle w:val="Normal"/>
+        <w:bidi w:val="0"/>
+        <w:jc w:val="start"/>
+        <w:rPr/>
+      </w:pPr>
+      <w:r>
+        <w:rPr/>
+      </w:r>
+    </w:p>
+    <w:p>
+      <w:pPr>
+        <w:pStyle w:val="Normal"/>
+        <w:bidi w:val="0"/>
+        <w:jc w:val="start"/>
+        <w:rPr/>
+      </w:pPr>
+      <w:r>
+        <w:rPr/>
+      </w:r>
+    </w:p>
+    <w:p>
+      <w:pPr>
+        <w:pStyle w:val="Normal"/>
+        <w:bidi w:val="0"/>
+        <w:jc w:val="start"/>
+        <w:rPr/>
+      </w:pPr>
+      <w:r>
+        <w:rPr/>
+        <w:t>Event Producer choreographs the events. In this case, the choreographed event has 3 unique steps. Message is sent to the broker, message is read by Step1 and work is done. New message is sent back to the broker, that new message is read by Step2. Step2 executes then returns another new message. Step3 then reads the message and executes on it. Event Producer is not involved at all after the initial production of the message.</w:t>
+      </w:r>
+    </w:p>
+    <w:p>
+      <w:pPr>
+        <w:pStyle w:val="Normal"/>
+        <w:bidi w:val="0"/>
+        <w:jc w:val="start"/>
+        <w:rPr/>
+      </w:pPr>
+      <w:r>
+        <w:rPr/>
+      </w:r>
+    </w:p>
+    <w:p>
+      <w:pPr>
+        <w:pStyle w:val="Normal"/>
+        <w:bidi w:val="0"/>
+        <w:jc w:val="start"/>
+        <w:rPr>
+          <w:i/>
+          <w:iCs/>
+        </w:rPr>
+      </w:pPr>
+      <w:r>
+        <w:rPr>
+          <w:i/>
+          <w:iCs/>
+        </w:rPr>
+        <w:t>Benefits and trade-offs of this message:</w:t>
+      </w:r>
+    </w:p>
+    <w:p>
+      <w:pPr>
+        <w:pStyle w:val="Normal"/>
+        <w:bidi w:val="0"/>
+        <w:jc w:val="start"/>
+        <w:rPr/>
+      </w:pPr>
+      <w:r>
+        <w:rPr/>
+        <w:t>-Increased performance over orchestration (no centralized orchestrator no bottleneck, we offload to the message broker instead)</w:t>
+      </w:r>
+    </w:p>
+    <w:p>
+      <w:pPr>
+        <w:pStyle w:val="Normal"/>
+        <w:bidi w:val="0"/>
+        <w:jc w:val="start"/>
+        <w:rPr/>
+      </w:pPr>
+      <w:r>
+        <w:rPr/>
+        <w:t>-Reduced total cost of ownership</w:t>
+      </w:r>
+    </w:p>
+    <w:p>
+      <w:pPr>
+        <w:pStyle w:val="Normal"/>
+        <w:bidi w:val="0"/>
+        <w:jc w:val="start"/>
+        <w:rPr/>
+      </w:pPr>
+      <w:r>
+        <w:rPr/>
+        <w:t>-Reduced reliability (since no central place to handle errors, there is more chance that a single event will fail to fire everywhere it is needed. We need to ensure error tracking and DLQs exist in the message broker to handle errors in workflow)</w:t>
+      </w:r>
+    </w:p>
+    <w:p>
+      <w:pPr>
+        <w:pStyle w:val="Normal"/>
+        <w:bidi w:val="0"/>
+        <w:jc w:val="start"/>
+        <w:rPr/>
+      </w:pPr>
+      <w:r>
+        <w:rPr/>
+        <w:t>-Reduced observability (since there is no central orchestrator, we don’t have a central point of observability. So understanding the status of the event is much more difficult, you got to look everywhere until you find the state of the current message. Also we got to look into message broker and DLQ)</w:t>
+      </w:r>
+    </w:p>
+    <w:p>
+      <w:pPr>
+        <w:pStyle w:val="Normal"/>
+        <w:bidi w:val="0"/>
+        <w:jc w:val="start"/>
+        <w:rPr/>
+      </w:pPr>
+      <w:r>
+        <w:rPr/>
+      </w:r>
+    </w:p>
+    <w:p>
+      <w:pPr>
+        <w:pStyle w:val="Normal"/>
+        <w:bidi w:val="0"/>
+        <w:jc w:val="start"/>
+        <w:rPr/>
+      </w:pPr>
+      <w:r>
+        <w:rPr/>
+      </w:r>
+    </w:p>
+    <w:p>
+      <w:pPr>
+        <w:pStyle w:val="Normal"/>
+        <w:bidi w:val="0"/>
+        <w:jc w:val="start"/>
+        <w:rPr/>
+      </w:pPr>
+      <w:r>
+        <w:rPr/>
+      </w:r>
+    </w:p>
+    <w:p>
+      <w:pPr>
+        <w:pStyle w:val="Normal"/>
+        <w:bidi w:val="0"/>
+        <w:jc w:val="start"/>
+        <w:rPr>
+          <w:u w:val="single"/>
+        </w:rPr>
+      </w:pPr>
+      <w:r>
+        <w:rPr>
+          <w:u w:val="single"/>
+        </w:rPr>
+        <w:t>Orchestrated events:</w:t>
+      </w:r>
+    </w:p>
+    <w:p>
+      <w:pPr>
+        <w:pStyle w:val="Normal"/>
+        <w:bidi w:val="0"/>
+        <w:jc w:val="start"/>
+        <w:rPr/>
+      </w:pPr>
+      <w:r>
+        <w:rPr/>
+        <w:t>Common pattern within the asynchronous, event-driven microservices model</w:t>
+      </w:r>
+    </w:p>
+    <w:p>
+      <w:pPr>
+        <w:pStyle w:val="Normal"/>
+        <w:bidi w:val="0"/>
+        <w:jc w:val="start"/>
+        <w:rPr/>
+      </w:pPr>
+      <w:r>
+        <w:rPr/>
+        <w:t>Use-cases:</w:t>
+      </w:r>
+    </w:p>
+    <w:p>
+      <w:pPr>
+        <w:pStyle w:val="Normal"/>
+        <w:bidi w:val="0"/>
+        <w:jc w:val="start"/>
+        <w:rPr/>
+      </w:pPr>
+      <w:r>
+        <w:rPr/>
+        <w:t xml:space="preserve">1.Sequential processing: </w:t>
+      </w:r>
+    </w:p>
+    <w:p>
+      <w:pPr>
+        <w:pStyle w:val="Normal"/>
+        <w:bidi w:val="0"/>
+        <w:jc w:val="start"/>
+        <w:rPr/>
+      </w:pPr>
+      <w:r>
+        <w:rPr/>
+        <w:t>Like Loan application to a Registration event, there is a sequence to follow, you cannot approve a loan before the credit report is returned. Therefore, the command and control center or central orchestrator must ensure it has a response on the credit score before triggering downstream actions. In this model, all communications is asynchronous but the producer of the original message becomes a consumer on the response.</w:t>
+      </w:r>
+    </w:p>
+    <w:p>
+      <w:pPr>
+        <w:pStyle w:val="Normal"/>
+        <w:bidi w:val="0"/>
+        <w:jc w:val="start"/>
+        <w:rPr/>
+      </w:pPr>
+      <w:r>
+        <w:rPr/>
+        <w:t>2.Command workflow scenario:</w:t>
+      </w:r>
+    </w:p>
+    <w:p>
+      <w:pPr>
+        <w:pStyle w:val="Normal"/>
+        <w:bidi w:val="0"/>
+        <w:jc w:val="start"/>
+        <w:rPr/>
+      </w:pPr>
+      <w:r>
+        <w:rPr/>
+        <w:t>There is a need to allocate infrastructure, before installing Kubernetes into a cloud provider in an automated fashion. You can make direct calls, but the blocking nature of those calls hinders the throughput of the system. So you can dispatch the event to a worker process. The worker does its work, say provisioning virtual machines, when it is done, it sends response message back to the intended command and control center. Once it has the infrastructure it needs, it can then dispatch another message to install Kubernetes to another worker providing the connection details of the newly created virtual machines or databases. This models allows for many Kubernetes clusters to be spun up at once through a single orchestrator call, since the calls become non-blocking asynchronous messages.</w:t>
+      </w:r>
+    </w:p>
+    <w:p>
+      <w:pPr>
+        <w:pStyle w:val="Normal"/>
+        <w:bidi w:val="0"/>
+        <w:jc w:val="start"/>
+        <w:rPr/>
+      </w:pPr>
+      <w:r>
+        <w:rPr/>
+        <w:t>3.Response required:</w:t>
+      </w:r>
+    </w:p>
+    <w:p>
+      <w:pPr>
+        <w:pStyle w:val="Normal"/>
+        <w:bidi w:val="0"/>
+        <w:jc w:val="start"/>
+        <w:rPr/>
+      </w:pPr>
+      <w:r>
+        <w:rPr/>
+        <w:t>Anytime, you are doing asynchronous messaging and you need a response, be it for sequential processing, command workflows or other use cases, the orchestrator can be the point where this response structure exists. It will aggregate all the responses into a master status that’s available to any system interested.</w:t>
+      </w:r>
+    </w:p>
+    <w:p>
+      <w:pPr>
+        <w:pStyle w:val="Normal"/>
+        <w:bidi w:val="0"/>
+        <w:jc w:val="start"/>
+        <w:rPr/>
+      </w:pPr>
+      <w:r>
+        <w:rPr/>
+      </w:r>
+    </w:p>
+    <w:p>
+      <w:pPr>
+        <w:pStyle w:val="Normal"/>
+        <w:bidi w:val="0"/>
+        <w:jc w:val="start"/>
+        <w:rPr/>
+      </w:pPr>
+      <w:r>
+        <w:rPr/>
+        <w:t xml:space="preserve">We have an Event producer, which will make RestFul Async calls over HTTP. We then have several steps, each of them knows about the message broker. Event broker makes a call to the Orchestrator, it creates a message and sends it to the broker. The broker exposes the message to Step1 and executes work. Step1 sends message back to the message broker then to Orchestrator. The Poller() from the Event producers polls orchestrator for a response. This process continues until all of our work is done. When finished, the polling will succeed and the entire work is done for our system. </w:t>
+      </w:r>
+    </w:p>
+    <w:p>
+      <w:pPr>
+        <w:pStyle w:val="Normal"/>
+        <w:bidi w:val="0"/>
+        <w:jc w:val="start"/>
+        <w:rPr/>
+      </w:pPr>
+      <w:r>
+        <w:rPr/>
+        <w:t xml:space="preserve"> </w:t>
+      </w:r>
+    </w:p>
+    <w:p>
+      <w:pPr>
+        <w:pStyle w:val="Normal"/>
+        <w:bidi w:val="0"/>
+        <w:jc w:val="start"/>
+        <w:rPr/>
+      </w:pPr>
+      <w:r>
+        <w:rPr/>
+        <w:drawing>
+          <wp:anchor distT="0" distB="0" distL="0" distR="0" simplePos="0" relativeHeight="3" behindDoc="0" locked="0" layoutInCell="0" allowOverlap="1">
+            <wp:simplePos x="0" y="0"/>
+            <wp:positionH relativeFrom="column">
+              <wp:align>center</wp:align>
+            </wp:positionH>
+            <wp:positionV relativeFrom="paragraph">
+              <wp:posOffset>635</wp:posOffset>
+            </wp:positionV>
+            <wp:extent cx="5616575" cy="2095500"/>
+            <wp:effectExtent l="0" t="0" r="0" b="0"/>
+            <wp:wrapSquare wrapText="largest"/>
+            <wp:docPr id="2" name="Image2"/>
+            <wp:cNvGraphicFramePr>
+              <a:graphicFrameLocks xmlns:a="http://schemas.openxmlformats.org/drawingml/2006/main" noChangeAspect="1"/>
+            </wp:cNvGraphicFramePr>
+            <a:graphic xmlns:a="http://schemas.openxmlformats.org/drawingml/2006/main">
+              <a:graphicData uri="http://schemas.openxmlformats.org/drawingml/2006/picture">
+                <pic:pic xmlns:pic="http://schemas.openxmlformats.org/drawingml/2006/picture">
+                  <pic:nvPicPr>
+                    <pic:cNvPr id="2" name="Image2"/>
+                    <pic:cNvPicPr>
+                      <a:picLocks noChangeAspect="1" noChangeArrowheads="1"/>
+                    </pic:cNvPicPr>
+                  </pic:nvPicPr>
+                  <pic:blipFill>
+                    <a:blip r:embed="rId3"/>
+                    <a:stretch>
+                      <a:fillRect/>
+                    </a:stretch>
+                  </pic:blipFill>
+                  <pic:spPr bwMode="auto">
+                    <a:xfrm>
+                      <a:off x="0" y="0"/>
+                      <a:ext cx="5616575" cy="2095500"/>
+                    </a:xfrm>
+                    <a:prstGeom prst="rect">
+                      <a:avLst/>
+                    </a:prstGeom>
+                    <a:noFill/>
+                  </pic:spPr>
+                </pic:pic>
+              </a:graphicData>
+            </a:graphic>
+          </wp:anchor>
+        </w:drawing>
+      </w:r>
+    </w:p>
+    <w:p>
+      <w:pPr>
+        <w:pStyle w:val="Normal"/>
+        <w:bidi w:val="0"/>
+        <w:jc w:val="start"/>
+        <w:rPr/>
+      </w:pPr>
+      <w:r>
+        <w:rPr/>
+      </w:r>
+    </w:p>
+    <w:p>
+      <w:pPr>
+        <w:pStyle w:val="Normal"/>
+        <w:bidi w:val="0"/>
+        <w:jc w:val="start"/>
+        <w:rPr/>
+      </w:pPr>
+      <w:r>
+        <w:rPr/>
+      </w:r>
+    </w:p>
+    <w:p>
+      <w:pPr>
+        <w:pStyle w:val="Normal"/>
+        <w:bidi w:val="0"/>
+        <w:jc w:val="start"/>
+        <w:rPr/>
+      </w:pPr>
+      <w:r>
+        <w:rPr/>
+      </w:r>
+    </w:p>
+    <w:p>
+      <w:pPr>
+        <w:pStyle w:val="Normal"/>
+        <w:bidi w:val="0"/>
+        <w:jc w:val="start"/>
+        <w:rPr/>
+      </w:pPr>
+      <w:r>
+        <w:rPr/>
+      </w:r>
+    </w:p>
+    <w:p>
+      <w:pPr>
+        <w:pStyle w:val="Normal"/>
+        <w:bidi w:val="0"/>
+        <w:jc w:val="start"/>
+        <w:rPr/>
+      </w:pPr>
+      <w:r>
+        <w:rPr/>
+      </w:r>
+    </w:p>
+    <w:p>
+      <w:pPr>
+        <w:pStyle w:val="Normal"/>
+        <w:bidi w:val="0"/>
+        <w:jc w:val="start"/>
+        <w:rPr/>
+      </w:pPr>
+      <w:r>
+        <w:rPr/>
+      </w:r>
+    </w:p>
+    <w:p>
+      <w:pPr>
+        <w:pStyle w:val="Normal"/>
+        <w:bidi w:val="0"/>
+        <w:jc w:val="start"/>
+        <w:rPr/>
+      </w:pPr>
+      <w:r>
+        <w:rPr/>
+      </w:r>
+    </w:p>
+    <w:p>
+      <w:pPr>
+        <w:pStyle w:val="Normal"/>
+        <w:bidi w:val="0"/>
+        <w:jc w:val="start"/>
+        <w:rPr/>
+      </w:pPr>
+      <w:r>
+        <w:rPr/>
+      </w:r>
+    </w:p>
+    <w:p>
+      <w:pPr>
+        <w:pStyle w:val="Normal"/>
+        <w:bidi w:val="0"/>
+        <w:jc w:val="start"/>
+        <w:rPr/>
+      </w:pPr>
+      <w:r>
+        <w:rPr/>
+      </w:r>
+    </w:p>
+    <w:p>
+      <w:pPr>
+        <w:pStyle w:val="Normal"/>
+        <w:bidi w:val="0"/>
+        <w:jc w:val="start"/>
+        <w:rPr/>
+      </w:pPr>
+      <w:r>
+        <w:rPr/>
+      </w:r>
+    </w:p>
+    <w:p>
+      <w:pPr>
+        <w:pStyle w:val="Normal"/>
+        <w:bidi w:val="0"/>
+        <w:jc w:val="start"/>
+        <w:rPr/>
+      </w:pPr>
+      <w:r>
+        <w:rPr/>
+      </w:r>
+    </w:p>
+    <w:p>
+      <w:pPr>
+        <w:pStyle w:val="Normal"/>
+        <w:bidi w:val="0"/>
+        <w:jc w:val="start"/>
+        <w:rPr/>
+      </w:pPr>
+      <w:r>
+        <w:rPr/>
+      </w:r>
+    </w:p>
+    <w:p>
+      <w:pPr>
+        <w:pStyle w:val="Normal"/>
+        <w:bidi w:val="0"/>
+        <w:jc w:val="start"/>
+        <w:rPr/>
+      </w:pPr>
+      <w:r>
+        <w:rPr/>
+      </w:r>
+    </w:p>
+    <w:p>
+      <w:pPr>
+        <w:pStyle w:val="Normal"/>
+        <w:bidi w:val="0"/>
+        <w:jc w:val="start"/>
+        <w:rPr/>
+      </w:pPr>
+      <w:r>
+        <w:rPr/>
+        <w:t>Benefits and trade-offs of this model:</w:t>
+      </w:r>
+    </w:p>
+    <w:p>
+      <w:pPr>
+        <w:pStyle w:val="Normal"/>
+        <w:bidi w:val="0"/>
+        <w:jc w:val="start"/>
+        <w:rPr/>
+      </w:pPr>
+      <w:r>
+        <w:rPr/>
+        <w:t>-Decreased performance:</w:t>
+      </w:r>
+    </w:p>
+    <w:p>
+      <w:pPr>
+        <w:pStyle w:val="Normal"/>
+        <w:bidi w:val="0"/>
+        <w:jc w:val="start"/>
+        <w:rPr/>
+      </w:pPr>
+      <w:r>
+        <w:rPr/>
+        <w:t>Due to single orchestrator, the steps funnel through a single process (bottleneck) so performance is decreased. Orchestrator must have a state machine of some kind to keep track of the status responses and code paths that handle the downstream actions. This all increases the total cost of ownership</w:t>
+      </w:r>
+    </w:p>
+    <w:p>
+      <w:pPr>
+        <w:pStyle w:val="Normal"/>
+        <w:bidi w:val="0"/>
+        <w:jc w:val="start"/>
+        <w:rPr/>
+      </w:pPr>
+      <w:r>
+        <w:rPr/>
+        <w:t>-Increased total cost of ownership</w:t>
+      </w:r>
+    </w:p>
+    <w:p>
+      <w:pPr>
+        <w:pStyle w:val="Normal"/>
+        <w:bidi w:val="0"/>
+        <w:jc w:val="start"/>
+        <w:rPr/>
+      </w:pPr>
+      <w:r>
+        <w:rPr/>
+        <w:t>-Increased reliability (in case of failures, the orchestrator can resubmit jobs into processing. You can also build much more robust error handling for outlier conditions)</w:t>
+      </w:r>
+    </w:p>
+    <w:p>
+      <w:pPr>
+        <w:pStyle w:val="Normal"/>
+        <w:bidi w:val="0"/>
+        <w:jc w:val="start"/>
+        <w:rPr/>
+      </w:pPr>
+      <w:r>
+        <w:rPr/>
+        <w:t>-Increased observability (Centralized controller becomes the sweet-spot for observability that can help the Operations team)</w:t>
+      </w:r>
+    </w:p>
+    <w:p>
+      <w:pPr>
+        <w:pStyle w:val="Normal"/>
+        <w:bidi w:val="0"/>
+        <w:jc w:val="start"/>
+        <w:rPr/>
+      </w:pPr>
+      <w:r>
+        <w:rPr/>
+      </w:r>
+    </w:p>
+    <w:p>
+      <w:pPr>
+        <w:pStyle w:val="Normal"/>
+        <w:bidi w:val="0"/>
+        <w:jc w:val="start"/>
+        <w:rPr/>
+      </w:pPr>
+      <w:r>
+        <w:rPr/>
+      </w:r>
+    </w:p>
+    <w:p>
+      <w:pPr>
+        <w:pStyle w:val="Normal"/>
+        <w:bidi w:val="0"/>
+        <w:jc w:val="start"/>
+        <w:rPr/>
+      </w:pPr>
+      <w:r>
+        <w:rPr/>
+      </w:r>
+    </w:p>
+    <w:p>
+      <w:pPr>
+        <w:pStyle w:val="Normal"/>
+        <w:bidi w:val="0"/>
+        <w:jc w:val="start"/>
+        <w:rPr/>
+      </w:pPr>
+      <w:r>
+        <w:rPr/>
+      </w:r>
+    </w:p>
+    <w:p>
+      <w:pPr>
+        <w:pStyle w:val="Normal"/>
+        <w:bidi w:val="0"/>
+        <w:jc w:val="start"/>
+        <w:rPr>
+          <w:u w:val="single"/>
+        </w:rPr>
+      </w:pPr>
+      <w:r>
+        <w:rPr>
+          <w:u w:val="single"/>
+        </w:rPr>
+        <w:t>Hybrid events:</w:t>
+      </w:r>
+    </w:p>
+    <w:p>
+      <w:pPr>
+        <w:pStyle w:val="Normal"/>
+        <w:bidi w:val="0"/>
+        <w:jc w:val="start"/>
+        <w:rPr/>
+      </w:pPr>
+      <w:r>
+        <w:rPr/>
+        <w:t>-You still have a centralized command and control center for the system as a whole but based on needs, we can still dispatch choreographed events to remote systems</w:t>
+      </w:r>
+    </w:p>
+    <w:p>
+      <w:pPr>
+        <w:pStyle w:val="Normal"/>
+        <w:bidi w:val="0"/>
+        <w:jc w:val="start"/>
+        <w:rPr/>
+      </w:pPr>
+      <w:r>
+        <w:rPr/>
+        <w:t>-Remote choreography (Remote choreographed events can inturn either stay choreographed or convert back to an internal command and control center)</w:t>
+      </w:r>
+    </w:p>
+    <w:p>
+      <w:pPr>
+        <w:pStyle w:val="Normal"/>
+        <w:bidi w:val="0"/>
+        <w:jc w:val="start"/>
+        <w:rPr/>
+      </w:pPr>
+      <w:r>
+        <w:rPr/>
+        <w:t>-Converted back to command and control if needed</w:t>
+      </w:r>
+    </w:p>
+    <w:p>
+      <w:pPr>
+        <w:pStyle w:val="Normal"/>
+        <w:bidi w:val="0"/>
+        <w:jc w:val="start"/>
+        <w:rPr/>
+      </w:pPr>
+      <w:r>
+        <w:rPr/>
+        <w:t>-Work gets done if the original command and control knows when everything is finished either directly in line or via some other polling mechanism</w:t>
+      </w:r>
+    </w:p>
+    <w:p>
+      <w:pPr>
+        <w:pStyle w:val="Normal"/>
+        <w:bidi w:val="0"/>
+        <w:jc w:val="start"/>
+        <w:rPr/>
+      </w:pPr>
+      <w:r>
+        <w:rPr/>
+      </w:r>
+    </w:p>
+    <w:p>
+      <w:pPr>
+        <w:pStyle w:val="Normal"/>
+        <w:bidi w:val="0"/>
+        <w:jc w:val="start"/>
+        <w:rPr/>
+      </w:pPr>
+      <w:r>
+        <w:rPr/>
+        <w:t>In Hybrid, the Central Orchestrator directs all traffic internally to the system of record but also kicks off choreographed workloads in remote systems. In the end, the remote system is responsible to alert the centralized command and control center that is it finished</w:t>
+      </w:r>
+    </w:p>
+    <w:p>
+      <w:pPr>
+        <w:pStyle w:val="Normal"/>
+        <w:bidi w:val="0"/>
+        <w:jc w:val="start"/>
+        <w:rPr/>
+      </w:pPr>
+      <w:r>
+        <w:rPr/>
+      </w:r>
+    </w:p>
+    <w:p>
+      <w:pPr>
+        <w:pStyle w:val="Normal"/>
+        <w:bidi w:val="0"/>
+        <w:jc w:val="start"/>
+        <w:rPr>
+          <w:i/>
+          <w:iCs/>
+          <w:u w:val="none"/>
+        </w:rPr>
+      </w:pPr>
+      <w:r>
+        <w:rPr>
+          <w:i/>
+          <w:iCs/>
+          <w:u w:val="none"/>
+        </w:rPr>
+        <w:t>Contract requirements:</w:t>
+      </w:r>
+    </w:p>
+    <w:p>
+      <w:pPr>
+        <w:pStyle w:val="Normal"/>
+        <w:bidi w:val="0"/>
+        <w:jc w:val="start"/>
+        <w:rPr/>
+      </w:pPr>
+      <w:r>
+        <w:rPr/>
+        <w:t>-Message contract / format must be well-documented, no room for error</w:t>
+      </w:r>
+    </w:p>
+    <w:p>
+      <w:pPr>
+        <w:pStyle w:val="Normal"/>
+        <w:bidi w:val="0"/>
+        <w:jc w:val="start"/>
+        <w:rPr/>
+      </w:pPr>
+      <w:r>
+        <w:rPr/>
+        <w:t>-Contract must be passive to change. When changes happen, they must not break downstream or upstream processes.</w:t>
+      </w:r>
+    </w:p>
+    <w:p>
+      <w:pPr>
+        <w:pStyle w:val="Normal"/>
+        <w:bidi w:val="0"/>
+        <w:jc w:val="start"/>
+        <w:rPr/>
+      </w:pPr>
+      <w:r>
+        <w:rPr/>
+        <w:t>-Contracts must be enforced rigorously.</w:t>
+      </w:r>
+    </w:p>
+    <w:p>
+      <w:pPr>
+        <w:pStyle w:val="Normal"/>
+        <w:bidi w:val="0"/>
+        <w:jc w:val="start"/>
+        <w:rPr/>
+      </w:pPr>
+      <w:r>
+        <w:rPr/>
+      </w:r>
+    </w:p>
+    <w:p>
+      <w:pPr>
+        <w:pStyle w:val="Normal"/>
+        <w:bidi w:val="0"/>
+        <w:jc w:val="start"/>
+        <w:rPr/>
+      </w:pPr>
+      <w:r>
+        <w:rPr/>
+      </w:r>
+    </w:p>
+    <w:p>
+      <w:pPr>
+        <w:pStyle w:val="Normal"/>
+        <w:bidi w:val="0"/>
+        <w:jc w:val="start"/>
+        <w:rPr/>
+      </w:pPr>
+      <w:r>
+        <w:rPr/>
+      </w:r>
+    </w:p>
+    <w:p>
+      <w:pPr>
+        <w:pStyle w:val="Normal"/>
+        <w:bidi w:val="0"/>
+        <w:jc w:val="start"/>
+        <w:rPr/>
+      </w:pPr>
+      <w:r>
+        <w:rPr/>
+      </w:r>
+    </w:p>
+    <w:p>
+      <w:pPr>
+        <w:pStyle w:val="Normal"/>
+        <w:bidi w:val="0"/>
+        <w:jc w:val="start"/>
+        <w:rPr/>
+      </w:pPr>
+      <w:r>
+        <w:rPr/>
+      </w:r>
+    </w:p>
+    <w:p>
+      <w:pPr>
+        <w:pStyle w:val="Normal"/>
+        <w:bidi w:val="0"/>
+        <w:jc w:val="start"/>
+        <w:rPr>
+          <w:b/>
+          <w:bCs/>
+          <w:u w:val="single"/>
+        </w:rPr>
+      </w:pPr>
+      <w:r>
+        <w:rPr>
+          <w:b/>
+          <w:bCs/>
+          <w:u w:val="single"/>
+        </w:rPr>
+        <w:t>Stream Data Platform</w:t>
+      </w:r>
+    </w:p>
+    <w:p>
+      <w:pPr>
+        <w:pStyle w:val="Normal"/>
+        <w:bidi w:val="0"/>
+        <w:jc w:val="start"/>
+        <w:rPr/>
+      </w:pPr>
+      <w:r>
+        <w:rPr/>
+      </w:r>
+    </w:p>
+    <w:p>
+      <w:pPr>
+        <w:pStyle w:val="Normal"/>
+        <w:bidi w:val="0"/>
+        <w:jc w:val="start"/>
+        <w:rPr/>
+      </w:pPr>
+      <w:r>
+        <w:rPr/>
+      </w:r>
+    </w:p>
+    <w:p>
+      <w:pPr>
+        <w:pStyle w:val="Normal"/>
+        <w:bidi w:val="0"/>
+        <w:jc w:val="start"/>
+        <w:rPr/>
+      </w:pPr>
+      <w:r>
+        <w:rPr/>
+      </w:r>
+    </w:p>
+    <w:p>
+      <w:pPr>
+        <w:pStyle w:val="Normal"/>
+        <w:bidi w:val="0"/>
+        <w:jc w:val="start"/>
+        <w:rPr/>
+      </w:pPr>
+      <w:r>
+        <w:rPr/>
+      </w:r>
+    </w:p>
+    <w:p>
+      <w:pPr>
+        <w:pStyle w:val="Normal"/>
+        <w:bidi w:val="0"/>
+        <w:jc w:val="start"/>
+        <w:rPr/>
+      </w:pPr>
+      <w:r>
+        <w:rPr/>
+      </w:r>
+    </w:p>
+    <w:p>
+      <w:pPr>
+        <w:pStyle w:val="Normal"/>
+        <w:bidi w:val="0"/>
+        <w:jc w:val="start"/>
+        <w:rPr/>
+      </w:pPr>
+      <w:r>
+        <w:rPr/>
+      </w:r>
+    </w:p>
+    <w:p>
+      <w:pPr>
+        <w:pStyle w:val="Normal"/>
+        <w:bidi w:val="0"/>
+        <w:jc w:val="start"/>
+        <w:rPr/>
+      </w:pPr>
+      <w:r>
+        <w:rPr/>
+      </w:r>
+    </w:p>
+    <w:p>
+      <w:pPr>
+        <w:pStyle w:val="Normal"/>
+        <w:bidi w:val="0"/>
+        <w:jc w:val="start"/>
+        <w:rPr/>
+      </w:pPr>
+      <w:r>
+        <w:rPr/>
+      </w:r>
+    </w:p>
+    <w:p>
+      <w:pPr>
+        <w:pStyle w:val="Normal"/>
+        <w:bidi w:val="0"/>
+        <w:jc w:val="start"/>
+        <w:rPr/>
+      </w:pPr>
+      <w:r>
+        <w:rPr/>
+      </w:r>
+    </w:p>
+    <w:p>
+      <w:pPr>
+        <w:pStyle w:val="Normal"/>
+        <w:bidi w:val="0"/>
+        <w:jc w:val="start"/>
+        <w:rPr/>
+      </w:pPr>
+      <w:r>
+        <w:rPr/>
+      </w:r>
+    </w:p>
+    <w:p>
+      <w:pPr>
+        <w:pStyle w:val="Normal"/>
+        <w:bidi w:val="0"/>
+        <w:jc w:val="start"/>
+        <w:rPr/>
+      </w:pPr>
+      <w:r>
+        <w:rPr/>
+      </w:r>
+    </w:p>
+    <w:p>
+      <w:pPr>
+        <w:pStyle w:val="Normal"/>
+        <w:bidi w:val="0"/>
+        <w:jc w:val="start"/>
+        <w:rPr/>
+      </w:pPr>
+      <w:r>
+        <w:rPr/>
+      </w:r>
+    </w:p>
+    <w:p>
+      <w:pPr>
+        <w:pStyle w:val="Normal"/>
+        <w:bidi w:val="0"/>
+        <w:jc w:val="start"/>
+        <w:rPr/>
+      </w:pPr>
+      <w:r>
+        <w:rPr/>
+      </w:r>
+    </w:p>
+    <w:p>
+      <w:pPr>
+        <w:pStyle w:val="Normal"/>
+        <w:bidi w:val="0"/>
+        <w:jc w:val="start"/>
+        <w:rPr/>
+      </w:pPr>
+      <w:r>
+        <w:rPr/>
+      </w:r>
+    </w:p>
+    <w:p>
+      <w:pPr>
+        <w:pStyle w:val="Normal"/>
+        <w:bidi w:val="0"/>
+        <w:jc w:val="start"/>
+        <w:rPr/>
+      </w:pPr>
+      <w:r>
+        <w:rPr/>
+      </w:r>
+    </w:p>
+    <w:p>
+      <w:pPr>
+        <w:pStyle w:val="Normal"/>
+        <w:bidi w:val="0"/>
+        <w:jc w:val="start"/>
+        <w:rPr/>
+      </w:pPr>
+      <w:r>
+        <w:rPr/>
       </w:r>
     </w:p>
     <w:p>
@@ -3749,8 +4878,8 @@
       <w:rFonts w:cs="Lucida Sans"/>
     </w:rPr>
   </w:style>
-  <w:style w:type="paragraph" w:styleId="FrameContents">
-    <w:name w:val="Frame Contents"/>
+  <w:style w:type="paragraph" w:styleId="FrameContentsuser">
+    <w:name w:val="Frame Contents (user)"/>
     <w:basedOn w:val="Normal"/>
     <w:qFormat/>
     <w:pPr/>

</xml_diff>